<commit_message>
Plantilla 20: «cotización» escrito, sin cuadro que elegir
El cuadro combinado de «La ___ deberá detallar cualquier ajuste de precios»
mostraba «oferta/cotización» y ofrecía «solicitud» o «cotización». Si la AC
no lo tocaba, la carta salía con la barra; y «la solicitud deberá detallar
ajustes de precios» no tiene sentido en una carta que pide una cotización.
La propia carta dice «cotización» en todas partes, así que va escrito.

Se desenvuelve el control dejando su corrida y su formato, y solo cambia el
texto de dentro. Los controles de juicio vuelven a ser 24.

Co-Authored-By: Claude Opus 5.5 <noreply@anthropic.com>
Claude-Session: https://claude.ai/code/session_01Bb2M9CMdugo64QchgYKNka
</commit_message>
<xml_diff>
--- a/generador/plantillas/20_Solicitud_cotizacion_renovacion.docx
+++ b/generador/plantillas/20_Solicitud_cotizacion_renovacion.docx
@@ -1044,39 +1044,16 @@
         </w:rPr>
         <w:t xml:space="preserve">La </w:t>
       </w:r>
-      <w:sdt>
-        <w:sdtPr>
-          <w:rPr>
-            <w:rFonts w:ascii="Titillium Web" w:hAnsi="Titillium Web"/>
-            <w:spacing w:val="-3"/>
-            <w:sz w:val="20"/>
-            <w:szCs w:val="20"/>
-            <w:lang w:val="es-EC"/>
-          </w:rPr>
-          <w:id w:val="-418098246"/>
-          <w:placeholder>
-            <w:docPart w:val="05DBFA4C8B5C46008425E402F7E151A8"/>
-          </w:placeholder>
-          <w:comboBox>
-            <w:listItem w:value="Elija un elemento."/>
-            <w:listItem w:displayText="solicitud" w:value="solicitud"/>
-            <w:listItem w:displayText="cotización" w:value="cotización"/>
-          </w:comboBox>
-        </w:sdtPr>
-        <w:sdtEndPr/>
-        <w:sdtContent>
-          <w:r>
-            <w:rPr>
-              <w:rFonts w:ascii="Titillium Web" w:hAnsi="Titillium Web"/>
-              <w:spacing w:val="-3"/>
-              <w:sz w:val="20"/>
-              <w:szCs w:val="20"/>
-              <w:lang w:val="es-EC"/>
-            </w:rPr>
-            <w:t>oferta/cotización</w:t>
-          </w:r>
-        </w:sdtContent>
-      </w:sdt>
+      <w:r>
+        <w:rPr>
+          <w:rFonts w:ascii="Titillium Web" w:hAnsi="Titillium Web"/>
+          <w:spacing w:val="-3"/>
+          <w:sz w:val="20"/>
+          <w:szCs w:val="20"/>
+          <w:lang w:val="es-EC"/>
+        </w:rPr>
+        <w:t xml:space="preserve">cotización</w:t>
+      </w:r>
       <w:r>
         <w:rPr>
           <w:rFonts w:ascii="Titillium Web" w:hAnsi="Titillium Web"/>

</xml_diff>